<commit_message>
i dont know but its late so im taking you home
</commit_message>
<xml_diff>
--- a/6 sem/АТПО/лаб.7/лаб.7.docx
+++ b/6 sem/АТПО/лаб.7/лаб.7.docx
@@ -4,38 +4,19 @@
   <w:body>
     <w:p>
       <w:r>
-        <w:t xml:space="preserve">Форма использовалась с сайта </w:t>
+        <w:t>Форма</w:t>
       </w:r>
-      <w:proofErr w:type="spellStart"/>
+      <w:bookmarkStart w:id="0" w:name="_GoBack"/>
+      <w:bookmarkEnd w:id="0"/>
       <w:r>
-        <w:rPr>
-          <w:lang w:val="en-US"/>
-        </w:rPr>
-        <w:t>fidjanis</w:t>
+        <w:t xml:space="preserve"> </w:t>
       </w:r>
-      <w:proofErr w:type="spellEnd"/>
       <w:r>
-        <w:t>.</w:t>
+        <w:t>https://danilaverbytskyy</w:t>
       </w:r>
-      <w:proofErr w:type="spellStart"/>
       <w:r>
-        <w:rPr>
-          <w:lang w:val="en-US"/>
-        </w:rPr>
-        <w:t>github</w:t>
+        <w:t>.github.io/web8.github.io</w:t>
       </w:r>
-      <w:proofErr w:type="spellEnd"/>
-      <w:r>
-        <w:t>.</w:t>
-      </w:r>
-      <w:proofErr w:type="spellStart"/>
-      <w:r>
-        <w:rPr>
-          <w:lang w:val="en-US"/>
-        </w:rPr>
-        <w:t>io</w:t>
-      </w:r>
-      <w:proofErr w:type="spellEnd"/>
     </w:p>
     <w:tbl>
       <w:tblPr>
@@ -44,14 +25,14 @@
         <w:tblLook w:val="04A0" w:firstRow="1" w:lastRow="0" w:firstColumn="1" w:lastColumn="0" w:noHBand="0" w:noVBand="1"/>
       </w:tblPr>
       <w:tblGrid>
-        <w:gridCol w:w="2689"/>
-        <w:gridCol w:w="3541"/>
-        <w:gridCol w:w="3115"/>
+        <w:gridCol w:w="562"/>
+        <w:gridCol w:w="3261"/>
+        <w:gridCol w:w="5522"/>
       </w:tblGrid>
       <w:tr>
         <w:tc>
           <w:tcPr>
-            <w:tcW w:w="2689" w:type="dxa"/>
+            <w:tcW w:w="562" w:type="dxa"/>
           </w:tcPr>
           <w:p>
             <w:r>
@@ -61,7 +42,7 @@
         </w:tc>
         <w:tc>
           <w:tcPr>
-            <w:tcW w:w="3541" w:type="dxa"/>
+            <w:tcW w:w="3261" w:type="dxa"/>
           </w:tcPr>
           <w:p>
             <w:r>
@@ -71,7 +52,7 @@
         </w:tc>
         <w:tc>
           <w:tcPr>
-            <w:tcW w:w="3115" w:type="dxa"/>
+            <w:tcW w:w="5522" w:type="dxa"/>
           </w:tcPr>
           <w:p>
             <w:r>
@@ -83,7 +64,7 @@
       <w:tr>
         <w:tc>
           <w:tcPr>
-            <w:tcW w:w="2689" w:type="dxa"/>
+            <w:tcW w:w="562" w:type="dxa"/>
           </w:tcPr>
           <w:p>
             <w:r>
@@ -93,7 +74,7 @@
         </w:tc>
         <w:tc>
           <w:tcPr>
-            <w:tcW w:w="3541" w:type="dxa"/>
+            <w:tcW w:w="3261" w:type="dxa"/>
           </w:tcPr>
           <w:p>
             <w:r>
@@ -103,31 +84,22 @@
         </w:tc>
         <w:tc>
           <w:tcPr>
-            <w:tcW w:w="3115" w:type="dxa"/>
-          </w:tcPr>
-          <w:p>
-            <w:r>
-              <w:t xml:space="preserve">Форма сохраняется в веб-формах или </w:t>
-            </w:r>
-            <w:r>
-              <w:rPr>
-                <w:lang w:val="en-US"/>
-              </w:rPr>
-              <w:t>SQL</w:t>
-            </w:r>
-            <w:r>
-              <w:t>-</w:t>
-            </w:r>
-            <w:r>
-              <w:t>таблицах</w:t>
-            </w:r>
-          </w:p>
-        </w:tc>
-      </w:tr>
-      <w:tr>
-        <w:tc>
-          <w:tcPr>
-            <w:tcW w:w="2689" w:type="dxa"/>
+            <w:tcW w:w="5522" w:type="dxa"/>
+          </w:tcPr>
+          <w:p>
+            <w:r>
+              <w:t>Фор</w:t>
+            </w:r>
+            <w:r>
+              <w:t>ма сохраняется в веб-формах</w:t>
+            </w:r>
+          </w:p>
+        </w:tc>
+      </w:tr>
+      <w:tr>
+        <w:tc>
+          <w:tcPr>
+            <w:tcW w:w="562" w:type="dxa"/>
           </w:tcPr>
           <w:p>
             <w:r>
@@ -137,7 +109,7 @@
         </w:tc>
         <w:tc>
           <w:tcPr>
-            <w:tcW w:w="3541" w:type="dxa"/>
+            <w:tcW w:w="3261" w:type="dxa"/>
           </w:tcPr>
           <w:p>
             <w:r>
@@ -147,7 +119,7 @@
         </w:tc>
         <w:tc>
           <w:tcPr>
-            <w:tcW w:w="3115" w:type="dxa"/>
+            <w:tcW w:w="5522" w:type="dxa"/>
           </w:tcPr>
           <w:p>
             <w:r>
@@ -159,7 +131,7 @@
       <w:tr>
         <w:tc>
           <w:tcPr>
-            <w:tcW w:w="2689" w:type="dxa"/>
+            <w:tcW w:w="562" w:type="dxa"/>
           </w:tcPr>
           <w:p>
             <w:r>
@@ -169,7 +141,7 @@
         </w:tc>
         <w:tc>
           <w:tcPr>
-            <w:tcW w:w="3541" w:type="dxa"/>
+            <w:tcW w:w="3261" w:type="dxa"/>
           </w:tcPr>
           <w:p>
             <w:r>
@@ -179,19 +151,25 @@
         </w:tc>
         <w:tc>
           <w:tcPr>
-            <w:tcW w:w="3115" w:type="dxa"/>
-          </w:tcPr>
-          <w:p>
-            <w:r>
-              <w:t>Появляется всплывающая строка, говорящее о необходимости заполнения поля</w:t>
-            </w:r>
-          </w:p>
-        </w:tc>
-      </w:tr>
-      <w:tr>
-        <w:tc>
-          <w:tcPr>
-            <w:tcW w:w="2689" w:type="dxa"/>
+            <w:tcW w:w="5522" w:type="dxa"/>
+          </w:tcPr>
+          <w:p>
+            <w:r>
+              <w:t>Появляет</w:t>
+            </w:r>
+            <w:r>
+              <w:t>ся всплывающее сообщение, говорящее</w:t>
+            </w:r>
+            <w:r>
+              <w:t xml:space="preserve"> о необходимости заполнения поля</w:t>
+            </w:r>
+          </w:p>
+        </w:tc>
+      </w:tr>
+      <w:tr>
+        <w:tc>
+          <w:tcPr>
+            <w:tcW w:w="562" w:type="dxa"/>
           </w:tcPr>
           <w:p>
             <w:r>
@@ -201,7 +179,7 @@
         </w:tc>
         <w:tc>
           <w:tcPr>
-            <w:tcW w:w="3541" w:type="dxa"/>
+            <w:tcW w:w="3261" w:type="dxa"/>
           </w:tcPr>
           <w:p>
             <w:r>
@@ -220,7 +198,7 @@
         </w:tc>
         <w:tc>
           <w:tcPr>
-            <w:tcW w:w="3115" w:type="dxa"/>
+            <w:tcW w:w="5522" w:type="dxa"/>
           </w:tcPr>
           <w:p>
             <w:r>
@@ -244,7 +222,7 @@
       <w:tr>
         <w:tc>
           <w:tcPr>
-            <w:tcW w:w="2689" w:type="dxa"/>
+            <w:tcW w:w="562" w:type="dxa"/>
           </w:tcPr>
           <w:p>
             <w:r>
@@ -254,22 +232,17 @@
         </w:tc>
         <w:tc>
           <w:tcPr>
-            <w:tcW w:w="3541" w:type="dxa"/>
-          </w:tcPr>
-          <w:p>
-            <w:r>
-              <w:t xml:space="preserve">Отправка формы с полями, </w:t>
-            </w:r>
-            <w:bookmarkStart w:id="0" w:name="_GoBack"/>
-            <w:bookmarkEnd w:id="0"/>
-            <w:r>
-              <w:t>содержащими спецсимволы</w:t>
-            </w:r>
-          </w:p>
-        </w:tc>
-        <w:tc>
-          <w:tcPr>
-            <w:tcW w:w="3115" w:type="dxa"/>
+            <w:tcW w:w="3261" w:type="dxa"/>
+          </w:tcPr>
+          <w:p>
+            <w:r>
+              <w:t>Отправка формы с полями, содержащими спецсимволы</w:t>
+            </w:r>
+          </w:p>
+        </w:tc>
+        <w:tc>
+          <w:tcPr>
+            <w:tcW w:w="5522" w:type="dxa"/>
           </w:tcPr>
           <w:p>
             <w:r>
@@ -285,7 +258,13 @@
               <w:t xml:space="preserve"> </w:t>
             </w:r>
             <w:r>
-              <w:t>не пропускает спец символы</w:t>
+              <w:t>не пропускает спец</w:t>
+            </w:r>
+            <w:r>
+              <w:t>иальные</w:t>
+            </w:r>
+            <w:r>
+              <w:t xml:space="preserve"> символы</w:t>
             </w:r>
             <w:r>
               <w:t xml:space="preserve"> </w:t>
@@ -296,7 +275,7 @@
       <w:tr>
         <w:tc>
           <w:tcPr>
-            <w:tcW w:w="2689" w:type="dxa"/>
+            <w:tcW w:w="562" w:type="dxa"/>
           </w:tcPr>
           <w:p>
             <w:r>
@@ -306,7 +285,7 @@
         </w:tc>
         <w:tc>
           <w:tcPr>
-            <w:tcW w:w="3541" w:type="dxa"/>
+            <w:tcW w:w="3261" w:type="dxa"/>
           </w:tcPr>
           <w:p>
             <w:r>
@@ -316,19 +295,22 @@
         </w:tc>
         <w:tc>
           <w:tcPr>
-            <w:tcW w:w="3115" w:type="dxa"/>
-          </w:tcPr>
-          <w:p>
-            <w:r>
-              <w:t>При неправильном заполнении формы или при не заполнении какого либо поля появляется всплывающее окно сообщение, в котором описана конкретная ошибка</w:t>
-            </w:r>
-          </w:p>
-        </w:tc>
-      </w:tr>
-      <w:tr>
-        <w:tc>
-          <w:tcPr>
-            <w:tcW w:w="2689" w:type="dxa"/>
+            <w:tcW w:w="5522" w:type="dxa"/>
+          </w:tcPr>
+          <w:p>
+            <w:r>
+              <w:t>При неправильном заполнении формы или при не заполнении какого либо поля появл</w:t>
+            </w:r>
+            <w:r>
+              <w:t>яется всплывающее окно сообщения</w:t>
+            </w:r>
+          </w:p>
+        </w:tc>
+      </w:tr>
+      <w:tr>
+        <w:tc>
+          <w:tcPr>
+            <w:tcW w:w="562" w:type="dxa"/>
           </w:tcPr>
           <w:p>
             <w:r>
@@ -338,7 +320,7 @@
         </w:tc>
         <w:tc>
           <w:tcPr>
-            <w:tcW w:w="3541" w:type="dxa"/>
+            <w:tcW w:w="3261" w:type="dxa"/>
           </w:tcPr>
           <w:p>
             <w:r>
@@ -355,137 +337,145 @@
             <w:r>
               <w:t>“</w:t>
             </w:r>
+          </w:p>
+          <w:p>
+            <w:r>
+              <w:t>Я согласен с политикой обработки персональных данных.</w:t>
+            </w:r>
+            <w:r>
+              <w:t>”</w:t>
+            </w:r>
+          </w:p>
+        </w:tc>
+        <w:tc>
+          <w:tcPr>
+            <w:tcW w:w="5522" w:type="dxa"/>
+          </w:tcPr>
+          <w:p>
+            <w:r>
+              <w:t>Данные не отправятся</w:t>
+            </w:r>
+            <w:r>
+              <w:t xml:space="preserve">, пока не активирован </w:t>
+            </w:r>
             <w:proofErr w:type="spellStart"/>
             <w:r>
-              <w:t>Согласитсья</w:t>
+              <w:t>чекбокс</w:t>
             </w:r>
             <w:proofErr w:type="spellEnd"/>
             <w:r>
-              <w:t xml:space="preserve"> с правилами</w:t>
-            </w:r>
-            <w:r>
-              <w:t>”</w:t>
-            </w:r>
-          </w:p>
-        </w:tc>
-        <w:tc>
-          <w:tcPr>
-            <w:tcW w:w="3115" w:type="dxa"/>
-          </w:tcPr>
-          <w:p>
-            <w:r>
-              <w:t xml:space="preserve">Кнопка отправки данных неактивна, пока не активирован </w:t>
+              <w:t xml:space="preserve"> «</w:t>
+            </w:r>
+          </w:p>
+          <w:p>
+            <w:r>
+              <w:t>Я согласен с политикой обработки персональных данных.</w:t>
+            </w:r>
+            <w:r>
+              <w:t>»</w:t>
+            </w:r>
+          </w:p>
+        </w:tc>
+      </w:tr>
+      <w:tr>
+        <w:tc>
+          <w:tcPr>
+            <w:tcW w:w="562" w:type="dxa"/>
+          </w:tcPr>
+          <w:p>
+            <w:r>
+              <w:t>8</w:t>
+            </w:r>
+          </w:p>
+        </w:tc>
+        <w:tc>
+          <w:tcPr>
+            <w:tcW w:w="3261" w:type="dxa"/>
+          </w:tcPr>
+          <w:p>
+            <w:r>
+              <w:t>Кнопка отправки при не правильных данных</w:t>
+            </w:r>
+          </w:p>
+        </w:tc>
+        <w:tc>
+          <w:tcPr>
+            <w:tcW w:w="5522" w:type="dxa"/>
+          </w:tcPr>
+          <w:p>
+            <w:r>
+              <w:t>Кнопка отправки будет неактивна, пока все поля не пройдут валидацию</w:t>
+            </w:r>
+          </w:p>
+        </w:tc>
+      </w:tr>
+      <w:tr>
+        <w:tc>
+          <w:tcPr>
+            <w:tcW w:w="562" w:type="dxa"/>
+          </w:tcPr>
+          <w:p>
+            <w:r>
+              <w:t>9</w:t>
+            </w:r>
+          </w:p>
+        </w:tc>
+        <w:tc>
+          <w:tcPr>
+            <w:tcW w:w="3261" w:type="dxa"/>
+          </w:tcPr>
+          <w:p>
+            <w:r>
+              <w:t>Валидация данных при наведении на поле курсором</w:t>
+            </w:r>
+          </w:p>
+        </w:tc>
+        <w:tc>
+          <w:tcPr>
+            <w:tcW w:w="5522" w:type="dxa"/>
+          </w:tcPr>
+          <w:p>
+            <w:r>
+              <w:t xml:space="preserve">Если данные не прошли валидацию, то при наведении курсором на поле появляется сообщение с ошибкой </w:t>
+            </w:r>
+          </w:p>
+        </w:tc>
+      </w:tr>
+      <w:tr>
+        <w:tc>
+          <w:tcPr>
+            <w:tcW w:w="562" w:type="dxa"/>
+          </w:tcPr>
+          <w:p>
+            <w:r>
+              <w:t>10</w:t>
+            </w:r>
+          </w:p>
+        </w:tc>
+        <w:tc>
+          <w:tcPr>
+            <w:tcW w:w="3261" w:type="dxa"/>
+          </w:tcPr>
+          <w:p>
+            <w:r>
+              <w:t xml:space="preserve">Текстовое многострочное поле при вводе объемного сообщения </w:t>
+            </w:r>
+          </w:p>
+        </w:tc>
+        <w:tc>
+          <w:tcPr>
+            <w:tcW w:w="5522" w:type="dxa"/>
+          </w:tcPr>
+          <w:p>
+            <w:r>
+              <w:t xml:space="preserve">При вводе объемного сообщения изменяет высоту либо в правой части появляется </w:t>
             </w:r>
             <w:proofErr w:type="spellStart"/>
             <w:r>
-              <w:t>чекбокс</w:t>
+              <w:t>скроллбар</w:t>
             </w:r>
             <w:proofErr w:type="spellEnd"/>
             <w:r>
-              <w:t xml:space="preserve"> «Согласиться с правилами», «Пользовательское соглашение»</w:t>
-            </w:r>
-          </w:p>
-        </w:tc>
-      </w:tr>
-      <w:tr>
-        <w:tc>
-          <w:tcPr>
-            <w:tcW w:w="2689" w:type="dxa"/>
-          </w:tcPr>
-          <w:p>
-            <w:r>
-              <w:t>8</w:t>
-            </w:r>
-          </w:p>
-        </w:tc>
-        <w:tc>
-          <w:tcPr>
-            <w:tcW w:w="3541" w:type="dxa"/>
-          </w:tcPr>
-          <w:p>
-            <w:r>
-              <w:t>Кнопка отправки при не правильных данных</w:t>
-            </w:r>
-          </w:p>
-        </w:tc>
-        <w:tc>
-          <w:tcPr>
-            <w:tcW w:w="3115" w:type="dxa"/>
-          </w:tcPr>
-          <w:p>
-            <w:r>
-              <w:t>Кнопка отправки будет неактивна, пока все поля не пройдут валидацию</w:t>
-            </w:r>
-          </w:p>
-        </w:tc>
-      </w:tr>
-      <w:tr>
-        <w:tc>
-          <w:tcPr>
-            <w:tcW w:w="2689" w:type="dxa"/>
-          </w:tcPr>
-          <w:p>
-            <w:r>
-              <w:t>9</w:t>
-            </w:r>
-          </w:p>
-        </w:tc>
-        <w:tc>
-          <w:tcPr>
-            <w:tcW w:w="3541" w:type="dxa"/>
-          </w:tcPr>
-          <w:p>
-            <w:r>
-              <w:t>Валидация данных при наведении на поле курсором</w:t>
-            </w:r>
-          </w:p>
-        </w:tc>
-        <w:tc>
-          <w:tcPr>
-            <w:tcW w:w="3115" w:type="dxa"/>
-          </w:tcPr>
-          <w:p>
-            <w:r>
-              <w:t xml:space="preserve">Если данные не прошли валидацию, то при наведении курсором на поле появляется сообщение с ошибкой </w:t>
-            </w:r>
-          </w:p>
-        </w:tc>
-      </w:tr>
-      <w:tr>
-        <w:tc>
-          <w:tcPr>
-            <w:tcW w:w="2689" w:type="dxa"/>
-          </w:tcPr>
-          <w:p>
-            <w:r>
-              <w:t>10</w:t>
-            </w:r>
-          </w:p>
-        </w:tc>
-        <w:tc>
-          <w:tcPr>
-            <w:tcW w:w="3541" w:type="dxa"/>
-          </w:tcPr>
-          <w:p>
-            <w:r>
-              <w:t xml:space="preserve">Текстовое многострочное поле при вводе объемного сообщения </w:t>
-            </w:r>
-          </w:p>
-        </w:tc>
-        <w:tc>
-          <w:tcPr>
-            <w:tcW w:w="3115" w:type="dxa"/>
-          </w:tcPr>
-          <w:p>
-            <w:r>
-              <w:t xml:space="preserve">При вводе объемного сообщения изменяет высоту либо в правой части появляется </w:t>
-            </w:r>
-            <w:proofErr w:type="spellStart"/>
-            <w:r>
-              <w:t>скроллбар</w:t>
-            </w:r>
-            <w:proofErr w:type="spellEnd"/>
-            <w:r>
               <w:t xml:space="preserve"> для просмотра всего содержимого.</w:t>
             </w:r>
           </w:p>
@@ -494,7 +484,7 @@
       <w:tr>
         <w:tc>
           <w:tcPr>
-            <w:tcW w:w="2689" w:type="dxa"/>
+            <w:tcW w:w="562" w:type="dxa"/>
           </w:tcPr>
           <w:p>
             <w:r>
@@ -504,7 +494,7 @@
         </w:tc>
         <w:tc>
           <w:tcPr>
-            <w:tcW w:w="3541" w:type="dxa"/>
+            <w:tcW w:w="3261" w:type="dxa"/>
           </w:tcPr>
           <w:p>
             <w:r>
@@ -514,7 +504,7 @@
         </w:tc>
         <w:tc>
           <w:tcPr>
-            <w:tcW w:w="3115" w:type="dxa"/>
+            <w:tcW w:w="5522" w:type="dxa"/>
           </w:tcPr>
           <w:p>
             <w:r>
@@ -547,7 +537,7 @@
       <w:tr>
         <w:tc>
           <w:tcPr>
-            <w:tcW w:w="2689" w:type="dxa"/>
+            <w:tcW w:w="562" w:type="dxa"/>
           </w:tcPr>
           <w:p>
             <w:r>
@@ -557,7 +547,7 @@
         </w:tc>
         <w:tc>
           <w:tcPr>
-            <w:tcW w:w="3541" w:type="dxa"/>
+            <w:tcW w:w="3261" w:type="dxa"/>
           </w:tcPr>
           <w:p>
             <w:r>
@@ -567,7 +557,7 @@
         </w:tc>
         <w:tc>
           <w:tcPr>
-            <w:tcW w:w="3115" w:type="dxa"/>
+            <w:tcW w:w="5522" w:type="dxa"/>
           </w:tcPr>
           <w:p>
             <w:r>
@@ -585,7 +575,7 @@
       <w:tr>
         <w:tc>
           <w:tcPr>
-            <w:tcW w:w="2689" w:type="dxa"/>
+            <w:tcW w:w="562" w:type="dxa"/>
           </w:tcPr>
           <w:p>
             <w:r>
@@ -595,7 +585,7 @@
         </w:tc>
         <w:tc>
           <w:tcPr>
-            <w:tcW w:w="3541" w:type="dxa"/>
+            <w:tcW w:w="3261" w:type="dxa"/>
           </w:tcPr>
           <w:p>
             <w:r>
@@ -613,34 +603,29 @@
         </w:tc>
         <w:tc>
           <w:tcPr>
-            <w:tcW w:w="3115" w:type="dxa"/>
-          </w:tcPr>
-          <w:p>
-            <w:r>
-              <w:t xml:space="preserve">Если названия полей не подписаны, то из контекста, написанного внутри поля, </w:t>
-            </w:r>
-            <w:r>
-              <w:lastRenderedPageBreak/>
-              <w:t>стало бы понятно какую информацию необходимо заполнить</w:t>
-            </w:r>
-          </w:p>
-        </w:tc>
-      </w:tr>
-      <w:tr>
-        <w:tc>
-          <w:tcPr>
-            <w:tcW w:w="2689" w:type="dxa"/>
-          </w:tcPr>
-          <w:p>
-            <w:r>
-              <w:lastRenderedPageBreak/>
+            <w:tcW w:w="5522" w:type="dxa"/>
+          </w:tcPr>
+          <w:p>
+            <w:r>
+              <w:t>Если названия полей не подписаны, то из контекста, написанного внутри поля, стало бы понятно какую информацию необходимо заполнить</w:t>
+            </w:r>
+          </w:p>
+        </w:tc>
+      </w:tr>
+      <w:tr>
+        <w:tc>
+          <w:tcPr>
+            <w:tcW w:w="562" w:type="dxa"/>
+          </w:tcPr>
+          <w:p>
+            <w:r>
               <w:t>14</w:t>
             </w:r>
           </w:p>
         </w:tc>
         <w:tc>
           <w:tcPr>
-            <w:tcW w:w="3541" w:type="dxa"/>
+            <w:tcW w:w="3261" w:type="dxa"/>
           </w:tcPr>
           <w:p>
             <w:r>
@@ -650,7 +635,7 @@
         </w:tc>
         <w:tc>
           <w:tcPr>
-            <w:tcW w:w="3115" w:type="dxa"/>
+            <w:tcW w:w="5522" w:type="dxa"/>
           </w:tcPr>
           <w:p>
             <w:r>
@@ -662,7 +647,7 @@
       <w:tr>
         <w:tc>
           <w:tcPr>
-            <w:tcW w:w="2689" w:type="dxa"/>
+            <w:tcW w:w="562" w:type="dxa"/>
           </w:tcPr>
           <w:p>
             <w:r>
@@ -672,7 +657,7 @@
         </w:tc>
         <w:tc>
           <w:tcPr>
-            <w:tcW w:w="3541" w:type="dxa"/>
+            <w:tcW w:w="3261" w:type="dxa"/>
           </w:tcPr>
           <w:p>
             <w:r>
@@ -682,7 +667,7 @@
         </w:tc>
         <w:tc>
           <w:tcPr>
-            <w:tcW w:w="3115" w:type="dxa"/>
+            <w:tcW w:w="5522" w:type="dxa"/>
           </w:tcPr>
           <w:p>
             <w:r>

</xml_diff>